<commit_message>
Colour observation sheets: 30 children rows
Co-Authored-By: Claude Opus 5.5 <noreply@anthropic.com>
Claude-Session: https://claude.ai/code/session_01RvXsjmA1DL5HHfNuUnQMYY
</commit_message>
<xml_diff>
--- a/Өнгө_таних_ажиглалт/10-р_сар_өнгө_таних_ажиглалт_2_нас.docx
+++ b/Өнгө_таних_ажиглалт/10-р_сар_өнгө_таних_ажиглалт_2_нас.docx
@@ -68,7 +68,7 @@
       </w:tblGrid>
       <w:tr>
         <w:trPr>
-          <w:trHeight w:val="1134" w:hRule="atLeast"/>
+          <w:trHeight w:val="1049" w:hRule="atLeast"/>
           <w:tblHeader w:val="true"/>
         </w:trPr>
         <w:tc>
@@ -131,7 +131,7 @@
             <w:r>
               <w:drawing>
                 <wp:inline xmlns:a="http://schemas.openxmlformats.org/drawingml/2006/main" xmlns:pic="http://schemas.openxmlformats.org/drawingml/2006/picture">
-                  <wp:extent cx="486000" cy="486000"/>
+                  <wp:extent cx="432000" cy="432000"/>
                   <wp:docPr id="1" name="Picture 1"/>
                   <wp:cNvGraphicFramePr>
                     <a:graphicFrameLocks noChangeAspect="1"/>
@@ -152,7 +152,7 @@
                         <pic:spPr>
                           <a:xfrm>
                             <a:off x="0" y="0"/>
-                            <a:ext cx="486000" cy="486000"/>
+                            <a:ext cx="432000" cy="432000"/>
                           </a:xfrm>
                           <a:prstGeom prst="rect"/>
                         </pic:spPr>
@@ -193,7 +193,7 @@
             <w:r>
               <w:drawing>
                 <wp:inline xmlns:a="http://schemas.openxmlformats.org/drawingml/2006/main" xmlns:pic="http://schemas.openxmlformats.org/drawingml/2006/picture">
-                  <wp:extent cx="486000" cy="486000"/>
+                  <wp:extent cx="432000" cy="432000"/>
                   <wp:docPr id="2" name="Picture 2"/>
                   <wp:cNvGraphicFramePr>
                     <a:graphicFrameLocks noChangeAspect="1"/>
@@ -214,7 +214,7 @@
                         <pic:spPr>
                           <a:xfrm>
                             <a:off x="0" y="0"/>
-                            <a:ext cx="486000" cy="486000"/>
+                            <a:ext cx="432000" cy="432000"/>
                           </a:xfrm>
                           <a:prstGeom prst="rect"/>
                         </pic:spPr>
@@ -255,7 +255,7 @@
             <w:r>
               <w:drawing>
                 <wp:inline xmlns:a="http://schemas.openxmlformats.org/drawingml/2006/main" xmlns:pic="http://schemas.openxmlformats.org/drawingml/2006/picture">
-                  <wp:extent cx="486000" cy="486000"/>
+                  <wp:extent cx="432000" cy="432000"/>
                   <wp:docPr id="3" name="Picture 3"/>
                   <wp:cNvGraphicFramePr>
                     <a:graphicFrameLocks noChangeAspect="1"/>
@@ -276,7 +276,7 @@
                         <pic:spPr>
                           <a:xfrm>
                             <a:off x="0" y="0"/>
-                            <a:ext cx="486000" cy="486000"/>
+                            <a:ext cx="432000" cy="432000"/>
                           </a:xfrm>
                           <a:prstGeom prst="rect"/>
                         </pic:spPr>
@@ -317,7 +317,7 @@
             <w:r>
               <w:drawing>
                 <wp:inline xmlns:a="http://schemas.openxmlformats.org/drawingml/2006/main" xmlns:pic="http://schemas.openxmlformats.org/drawingml/2006/picture">
-                  <wp:extent cx="486000" cy="486000"/>
+                  <wp:extent cx="432000" cy="432000"/>
                   <wp:docPr id="4" name="Picture 4"/>
                   <wp:cNvGraphicFramePr>
                     <a:graphicFrameLocks noChangeAspect="1"/>
@@ -338,7 +338,7 @@
                         <pic:spPr>
                           <a:xfrm>
                             <a:off x="0" y="0"/>
-                            <a:ext cx="486000" cy="486000"/>
+                            <a:ext cx="432000" cy="432000"/>
                           </a:xfrm>
                           <a:prstGeom prst="rect"/>
                         </pic:spPr>
@@ -794,7 +794,7 @@
       </w:tr>
       <w:tr>
         <w:trPr>
-          <w:trHeight w:val="295" w:hRule="atLeast"/>
+          <w:trHeight w:val="255" w:hRule="atLeast"/>
         </w:trPr>
         <w:tc>
           <w:tcPr>
@@ -896,7 +896,7 @@
       </w:tr>
       <w:tr>
         <w:trPr>
-          <w:trHeight w:val="295" w:hRule="atLeast"/>
+          <w:trHeight w:val="255" w:hRule="atLeast"/>
         </w:trPr>
         <w:tc>
           <w:tcPr>
@@ -1010,7 +1010,7 @@
       </w:tr>
       <w:tr>
         <w:trPr>
-          <w:trHeight w:val="295" w:hRule="atLeast"/>
+          <w:trHeight w:val="255" w:hRule="atLeast"/>
         </w:trPr>
         <w:tc>
           <w:tcPr>
@@ -1112,7 +1112,7 @@
       </w:tr>
       <w:tr>
         <w:trPr>
-          <w:trHeight w:val="295" w:hRule="atLeast"/>
+          <w:trHeight w:val="255" w:hRule="atLeast"/>
         </w:trPr>
         <w:tc>
           <w:tcPr>
@@ -1226,7 +1226,7 @@
       </w:tr>
       <w:tr>
         <w:trPr>
-          <w:trHeight w:val="295" w:hRule="atLeast"/>
+          <w:trHeight w:val="255" w:hRule="atLeast"/>
         </w:trPr>
         <w:tc>
           <w:tcPr>
@@ -1328,7 +1328,7 @@
       </w:tr>
       <w:tr>
         <w:trPr>
-          <w:trHeight w:val="295" w:hRule="atLeast"/>
+          <w:trHeight w:val="255" w:hRule="atLeast"/>
         </w:trPr>
         <w:tc>
           <w:tcPr>
@@ -1442,7 +1442,7 @@
       </w:tr>
       <w:tr>
         <w:trPr>
-          <w:trHeight w:val="295" w:hRule="atLeast"/>
+          <w:trHeight w:val="255" w:hRule="atLeast"/>
         </w:trPr>
         <w:tc>
           <w:tcPr>
@@ -1544,7 +1544,7 @@
       </w:tr>
       <w:tr>
         <w:trPr>
-          <w:trHeight w:val="295" w:hRule="atLeast"/>
+          <w:trHeight w:val="255" w:hRule="atLeast"/>
         </w:trPr>
         <w:tc>
           <w:tcPr>
@@ -1658,7 +1658,7 @@
       </w:tr>
       <w:tr>
         <w:trPr>
-          <w:trHeight w:val="295" w:hRule="atLeast"/>
+          <w:trHeight w:val="255" w:hRule="atLeast"/>
         </w:trPr>
         <w:tc>
           <w:tcPr>
@@ -1760,7 +1760,7 @@
       </w:tr>
       <w:tr>
         <w:trPr>
-          <w:trHeight w:val="295" w:hRule="atLeast"/>
+          <w:trHeight w:val="255" w:hRule="atLeast"/>
         </w:trPr>
         <w:tc>
           <w:tcPr>
@@ -1874,7 +1874,7 @@
       </w:tr>
       <w:tr>
         <w:trPr>
-          <w:trHeight w:val="295" w:hRule="atLeast"/>
+          <w:trHeight w:val="255" w:hRule="atLeast"/>
         </w:trPr>
         <w:tc>
           <w:tcPr>
@@ -1976,7 +1976,7 @@
       </w:tr>
       <w:tr>
         <w:trPr>
-          <w:trHeight w:val="295" w:hRule="atLeast"/>
+          <w:trHeight w:val="255" w:hRule="atLeast"/>
         </w:trPr>
         <w:tc>
           <w:tcPr>
@@ -2090,7 +2090,7 @@
       </w:tr>
       <w:tr>
         <w:trPr>
-          <w:trHeight w:val="295" w:hRule="atLeast"/>
+          <w:trHeight w:val="255" w:hRule="atLeast"/>
         </w:trPr>
         <w:tc>
           <w:tcPr>
@@ -2192,7 +2192,7 @@
       </w:tr>
       <w:tr>
         <w:trPr>
-          <w:trHeight w:val="295" w:hRule="atLeast"/>
+          <w:trHeight w:val="255" w:hRule="atLeast"/>
         </w:trPr>
         <w:tc>
           <w:tcPr>
@@ -2306,7 +2306,7 @@
       </w:tr>
       <w:tr>
         <w:trPr>
-          <w:trHeight w:val="295" w:hRule="atLeast"/>
+          <w:trHeight w:val="255" w:hRule="atLeast"/>
         </w:trPr>
         <w:tc>
           <w:tcPr>
@@ -2408,7 +2408,7 @@
       </w:tr>
       <w:tr>
         <w:trPr>
-          <w:trHeight w:val="295" w:hRule="atLeast"/>
+          <w:trHeight w:val="255" w:hRule="atLeast"/>
         </w:trPr>
         <w:tc>
           <w:tcPr>
@@ -2522,7 +2522,7 @@
       </w:tr>
       <w:tr>
         <w:trPr>
-          <w:trHeight w:val="295" w:hRule="atLeast"/>
+          <w:trHeight w:val="255" w:hRule="atLeast"/>
         </w:trPr>
         <w:tc>
           <w:tcPr>
@@ -2624,7 +2624,7 @@
       </w:tr>
       <w:tr>
         <w:trPr>
-          <w:trHeight w:val="295" w:hRule="atLeast"/>
+          <w:trHeight w:val="255" w:hRule="atLeast"/>
         </w:trPr>
         <w:tc>
           <w:tcPr>
@@ -2738,7 +2738,7 @@
       </w:tr>
       <w:tr>
         <w:trPr>
-          <w:trHeight w:val="295" w:hRule="atLeast"/>
+          <w:trHeight w:val="255" w:hRule="atLeast"/>
         </w:trPr>
         <w:tc>
           <w:tcPr>
@@ -2840,7 +2840,7 @@
       </w:tr>
       <w:tr>
         <w:trPr>
-          <w:trHeight w:val="295" w:hRule="atLeast"/>
+          <w:trHeight w:val="255" w:hRule="atLeast"/>
         </w:trPr>
         <w:tc>
           <w:tcPr>
@@ -2954,7 +2954,7 @@
       </w:tr>
       <w:tr>
         <w:trPr>
-          <w:trHeight w:val="295" w:hRule="atLeast"/>
+          <w:trHeight w:val="255" w:hRule="atLeast"/>
         </w:trPr>
         <w:tc>
           <w:tcPr>
@@ -3056,7 +3056,7 @@
       </w:tr>
       <w:tr>
         <w:trPr>
-          <w:trHeight w:val="295" w:hRule="atLeast"/>
+          <w:trHeight w:val="255" w:hRule="atLeast"/>
         </w:trPr>
         <w:tc>
           <w:tcPr>
@@ -3170,7 +3170,7 @@
       </w:tr>
       <w:tr>
         <w:trPr>
-          <w:trHeight w:val="295" w:hRule="atLeast"/>
+          <w:trHeight w:val="255" w:hRule="atLeast"/>
         </w:trPr>
         <w:tc>
           <w:tcPr>
@@ -3272,7 +3272,7 @@
       </w:tr>
       <w:tr>
         <w:trPr>
-          <w:trHeight w:val="295" w:hRule="atLeast"/>
+          <w:trHeight w:val="255" w:hRule="atLeast"/>
         </w:trPr>
         <w:tc>
           <w:tcPr>
@@ -3386,7 +3386,7 @@
       </w:tr>
       <w:tr>
         <w:trPr>
-          <w:trHeight w:val="295" w:hRule="atLeast"/>
+          <w:trHeight w:val="255" w:hRule="atLeast"/>
         </w:trPr>
         <w:tc>
           <w:tcPr>
@@ -3482,6 +3482,552 @@
         <w:tc>
           <w:tcPr>
             <w:tcW w:type="dxa" w:w="635"/>
+          </w:tcPr>
+          <w:p/>
+        </w:tc>
+      </w:tr>
+      <w:tr>
+        <w:trPr>
+          <w:trHeight w:val="255" w:hRule="atLeast"/>
+        </w:trPr>
+        <w:tc>
+          <w:tcPr>
+            <w:tcW w:type="dxa" w:w="397"/>
+            <w:vAlign w:val="center"/>
+          </w:tcPr>
+          <w:p>
+            <w:pPr>
+              <w:spacing w:after="0" w:before="0"/>
+              <w:jc w:val="center"/>
+            </w:pPr>
+            <w:r>
+              <w:rPr>
+                <w:b w:val="0"/>
+                <w:sz w:val="18"/>
+              </w:rPr>
+              <w:t>26</w:t>
+            </w:r>
+          </w:p>
+        </w:tc>
+        <w:tc>
+          <w:tcPr>
+            <w:tcW w:type="dxa" w:w="2778"/>
+          </w:tcPr>
+          <w:p/>
+        </w:tc>
+        <w:tc>
+          <w:tcPr>
+            <w:tcW w:type="dxa" w:w="635"/>
+            <w:shd w:val="clear" w:color="auto" w:fill="FDE2E2"/>
+          </w:tcPr>
+          <w:p/>
+        </w:tc>
+        <w:tc>
+          <w:tcPr>
+            <w:tcW w:type="dxa" w:w="635"/>
+            <w:shd w:val="clear" w:color="auto" w:fill="FDE2E2"/>
+          </w:tcPr>
+          <w:p/>
+        </w:tc>
+        <w:tc>
+          <w:tcPr>
+            <w:tcW w:type="dxa" w:w="635"/>
+            <w:shd w:val="clear" w:color="auto" w:fill="FDE2E2"/>
+          </w:tcPr>
+          <w:p/>
+        </w:tc>
+        <w:tc>
+          <w:tcPr>
+            <w:tcW w:type="dxa" w:w="635"/>
+            <w:shd w:val="clear" w:color="auto" w:fill="FEF6D0"/>
+          </w:tcPr>
+          <w:p/>
+        </w:tc>
+        <w:tc>
+          <w:tcPr>
+            <w:tcW w:type="dxa" w:w="635"/>
+            <w:shd w:val="clear" w:color="auto" w:fill="FEF6D0"/>
+          </w:tcPr>
+          <w:p/>
+        </w:tc>
+        <w:tc>
+          <w:tcPr>
+            <w:tcW w:type="dxa" w:w="635"/>
+            <w:shd w:val="clear" w:color="auto" w:fill="FEF6D0"/>
+          </w:tcPr>
+          <w:p/>
+        </w:tc>
+        <w:tc>
+          <w:tcPr>
+            <w:tcW w:type="dxa" w:w="635"/>
+            <w:shd w:val="clear" w:color="auto" w:fill="DCE7FD"/>
+          </w:tcPr>
+          <w:p/>
+        </w:tc>
+        <w:tc>
+          <w:tcPr>
+            <w:tcW w:type="dxa" w:w="635"/>
+            <w:shd w:val="clear" w:color="auto" w:fill="DCE7FD"/>
+          </w:tcPr>
+          <w:p/>
+        </w:tc>
+        <w:tc>
+          <w:tcPr>
+            <w:tcW w:type="dxa" w:w="635"/>
+            <w:shd w:val="clear" w:color="auto" w:fill="DCE7FD"/>
+          </w:tcPr>
+          <w:p/>
+        </w:tc>
+        <w:tc>
+          <w:tcPr>
+            <w:tcW w:type="dxa" w:w="635"/>
+            <w:shd w:val="clear" w:color="auto" w:fill="DCF3E4"/>
+          </w:tcPr>
+          <w:p/>
+        </w:tc>
+        <w:tc>
+          <w:tcPr>
+            <w:tcW w:type="dxa" w:w="635"/>
+            <w:shd w:val="clear" w:color="auto" w:fill="DCF3E4"/>
+          </w:tcPr>
+          <w:p/>
+        </w:tc>
+        <w:tc>
+          <w:tcPr>
+            <w:tcW w:type="dxa" w:w="635"/>
+            <w:shd w:val="clear" w:color="auto" w:fill="DCF3E4"/>
+          </w:tcPr>
+          <w:p/>
+        </w:tc>
+      </w:tr>
+      <w:tr>
+        <w:trPr>
+          <w:trHeight w:val="255" w:hRule="atLeast"/>
+        </w:trPr>
+        <w:tc>
+          <w:tcPr>
+            <w:tcW w:type="dxa" w:w="397"/>
+            <w:vAlign w:val="center"/>
+          </w:tcPr>
+          <w:p>
+            <w:pPr>
+              <w:spacing w:after="0" w:before="0"/>
+              <w:jc w:val="center"/>
+            </w:pPr>
+            <w:r>
+              <w:rPr>
+                <w:b w:val="0"/>
+                <w:sz w:val="18"/>
+              </w:rPr>
+              <w:t>27</w:t>
+            </w:r>
+          </w:p>
+        </w:tc>
+        <w:tc>
+          <w:tcPr>
+            <w:tcW w:type="dxa" w:w="2778"/>
+          </w:tcPr>
+          <w:p/>
+        </w:tc>
+        <w:tc>
+          <w:tcPr>
+            <w:tcW w:type="dxa" w:w="635"/>
+          </w:tcPr>
+          <w:p/>
+        </w:tc>
+        <w:tc>
+          <w:tcPr>
+            <w:tcW w:type="dxa" w:w="635"/>
+          </w:tcPr>
+          <w:p/>
+        </w:tc>
+        <w:tc>
+          <w:tcPr>
+            <w:tcW w:type="dxa" w:w="635"/>
+          </w:tcPr>
+          <w:p/>
+        </w:tc>
+        <w:tc>
+          <w:tcPr>
+            <w:tcW w:type="dxa" w:w="635"/>
+          </w:tcPr>
+          <w:p/>
+        </w:tc>
+        <w:tc>
+          <w:tcPr>
+            <w:tcW w:type="dxa" w:w="635"/>
+          </w:tcPr>
+          <w:p/>
+        </w:tc>
+        <w:tc>
+          <w:tcPr>
+            <w:tcW w:type="dxa" w:w="635"/>
+          </w:tcPr>
+          <w:p/>
+        </w:tc>
+        <w:tc>
+          <w:tcPr>
+            <w:tcW w:type="dxa" w:w="635"/>
+          </w:tcPr>
+          <w:p/>
+        </w:tc>
+        <w:tc>
+          <w:tcPr>
+            <w:tcW w:type="dxa" w:w="635"/>
+          </w:tcPr>
+          <w:p/>
+        </w:tc>
+        <w:tc>
+          <w:tcPr>
+            <w:tcW w:type="dxa" w:w="635"/>
+          </w:tcPr>
+          <w:p/>
+        </w:tc>
+        <w:tc>
+          <w:tcPr>
+            <w:tcW w:type="dxa" w:w="635"/>
+          </w:tcPr>
+          <w:p/>
+        </w:tc>
+        <w:tc>
+          <w:tcPr>
+            <w:tcW w:type="dxa" w:w="635"/>
+          </w:tcPr>
+          <w:p/>
+        </w:tc>
+        <w:tc>
+          <w:tcPr>
+            <w:tcW w:type="dxa" w:w="635"/>
+          </w:tcPr>
+          <w:p/>
+        </w:tc>
+      </w:tr>
+      <w:tr>
+        <w:trPr>
+          <w:trHeight w:val="255" w:hRule="atLeast"/>
+        </w:trPr>
+        <w:tc>
+          <w:tcPr>
+            <w:tcW w:type="dxa" w:w="397"/>
+            <w:vAlign w:val="center"/>
+          </w:tcPr>
+          <w:p>
+            <w:pPr>
+              <w:spacing w:after="0" w:before="0"/>
+              <w:jc w:val="center"/>
+            </w:pPr>
+            <w:r>
+              <w:rPr>
+                <w:b w:val="0"/>
+                <w:sz w:val="18"/>
+              </w:rPr>
+              <w:t>28</w:t>
+            </w:r>
+          </w:p>
+        </w:tc>
+        <w:tc>
+          <w:tcPr>
+            <w:tcW w:type="dxa" w:w="2778"/>
+          </w:tcPr>
+          <w:p/>
+        </w:tc>
+        <w:tc>
+          <w:tcPr>
+            <w:tcW w:type="dxa" w:w="635"/>
+            <w:shd w:val="clear" w:color="auto" w:fill="FDE2E2"/>
+          </w:tcPr>
+          <w:p/>
+        </w:tc>
+        <w:tc>
+          <w:tcPr>
+            <w:tcW w:type="dxa" w:w="635"/>
+            <w:shd w:val="clear" w:color="auto" w:fill="FDE2E2"/>
+          </w:tcPr>
+          <w:p/>
+        </w:tc>
+        <w:tc>
+          <w:tcPr>
+            <w:tcW w:type="dxa" w:w="635"/>
+            <w:shd w:val="clear" w:color="auto" w:fill="FDE2E2"/>
+          </w:tcPr>
+          <w:p/>
+        </w:tc>
+        <w:tc>
+          <w:tcPr>
+            <w:tcW w:type="dxa" w:w="635"/>
+            <w:shd w:val="clear" w:color="auto" w:fill="FEF6D0"/>
+          </w:tcPr>
+          <w:p/>
+        </w:tc>
+        <w:tc>
+          <w:tcPr>
+            <w:tcW w:type="dxa" w:w="635"/>
+            <w:shd w:val="clear" w:color="auto" w:fill="FEF6D0"/>
+          </w:tcPr>
+          <w:p/>
+        </w:tc>
+        <w:tc>
+          <w:tcPr>
+            <w:tcW w:type="dxa" w:w="635"/>
+            <w:shd w:val="clear" w:color="auto" w:fill="FEF6D0"/>
+          </w:tcPr>
+          <w:p/>
+        </w:tc>
+        <w:tc>
+          <w:tcPr>
+            <w:tcW w:type="dxa" w:w="635"/>
+            <w:shd w:val="clear" w:color="auto" w:fill="DCE7FD"/>
+          </w:tcPr>
+          <w:p/>
+        </w:tc>
+        <w:tc>
+          <w:tcPr>
+            <w:tcW w:type="dxa" w:w="635"/>
+            <w:shd w:val="clear" w:color="auto" w:fill="DCE7FD"/>
+          </w:tcPr>
+          <w:p/>
+        </w:tc>
+        <w:tc>
+          <w:tcPr>
+            <w:tcW w:type="dxa" w:w="635"/>
+            <w:shd w:val="clear" w:color="auto" w:fill="DCE7FD"/>
+          </w:tcPr>
+          <w:p/>
+        </w:tc>
+        <w:tc>
+          <w:tcPr>
+            <w:tcW w:type="dxa" w:w="635"/>
+            <w:shd w:val="clear" w:color="auto" w:fill="DCF3E4"/>
+          </w:tcPr>
+          <w:p/>
+        </w:tc>
+        <w:tc>
+          <w:tcPr>
+            <w:tcW w:type="dxa" w:w="635"/>
+            <w:shd w:val="clear" w:color="auto" w:fill="DCF3E4"/>
+          </w:tcPr>
+          <w:p/>
+        </w:tc>
+        <w:tc>
+          <w:tcPr>
+            <w:tcW w:type="dxa" w:w="635"/>
+            <w:shd w:val="clear" w:color="auto" w:fill="DCF3E4"/>
+          </w:tcPr>
+          <w:p/>
+        </w:tc>
+      </w:tr>
+      <w:tr>
+        <w:trPr>
+          <w:trHeight w:val="255" w:hRule="atLeast"/>
+        </w:trPr>
+        <w:tc>
+          <w:tcPr>
+            <w:tcW w:type="dxa" w:w="397"/>
+            <w:vAlign w:val="center"/>
+          </w:tcPr>
+          <w:p>
+            <w:pPr>
+              <w:spacing w:after="0" w:before="0"/>
+              <w:jc w:val="center"/>
+            </w:pPr>
+            <w:r>
+              <w:rPr>
+                <w:b w:val="0"/>
+                <w:sz w:val="18"/>
+              </w:rPr>
+              <w:t>29</w:t>
+            </w:r>
+          </w:p>
+        </w:tc>
+        <w:tc>
+          <w:tcPr>
+            <w:tcW w:type="dxa" w:w="2778"/>
+          </w:tcPr>
+          <w:p/>
+        </w:tc>
+        <w:tc>
+          <w:tcPr>
+            <w:tcW w:type="dxa" w:w="635"/>
+          </w:tcPr>
+          <w:p/>
+        </w:tc>
+        <w:tc>
+          <w:tcPr>
+            <w:tcW w:type="dxa" w:w="635"/>
+          </w:tcPr>
+          <w:p/>
+        </w:tc>
+        <w:tc>
+          <w:tcPr>
+            <w:tcW w:type="dxa" w:w="635"/>
+          </w:tcPr>
+          <w:p/>
+        </w:tc>
+        <w:tc>
+          <w:tcPr>
+            <w:tcW w:type="dxa" w:w="635"/>
+          </w:tcPr>
+          <w:p/>
+        </w:tc>
+        <w:tc>
+          <w:tcPr>
+            <w:tcW w:type="dxa" w:w="635"/>
+          </w:tcPr>
+          <w:p/>
+        </w:tc>
+        <w:tc>
+          <w:tcPr>
+            <w:tcW w:type="dxa" w:w="635"/>
+          </w:tcPr>
+          <w:p/>
+        </w:tc>
+        <w:tc>
+          <w:tcPr>
+            <w:tcW w:type="dxa" w:w="635"/>
+          </w:tcPr>
+          <w:p/>
+        </w:tc>
+        <w:tc>
+          <w:tcPr>
+            <w:tcW w:type="dxa" w:w="635"/>
+          </w:tcPr>
+          <w:p/>
+        </w:tc>
+        <w:tc>
+          <w:tcPr>
+            <w:tcW w:type="dxa" w:w="635"/>
+          </w:tcPr>
+          <w:p/>
+        </w:tc>
+        <w:tc>
+          <w:tcPr>
+            <w:tcW w:type="dxa" w:w="635"/>
+          </w:tcPr>
+          <w:p/>
+        </w:tc>
+        <w:tc>
+          <w:tcPr>
+            <w:tcW w:type="dxa" w:w="635"/>
+          </w:tcPr>
+          <w:p/>
+        </w:tc>
+        <w:tc>
+          <w:tcPr>
+            <w:tcW w:type="dxa" w:w="635"/>
+          </w:tcPr>
+          <w:p/>
+        </w:tc>
+      </w:tr>
+      <w:tr>
+        <w:trPr>
+          <w:trHeight w:val="255" w:hRule="atLeast"/>
+        </w:trPr>
+        <w:tc>
+          <w:tcPr>
+            <w:tcW w:type="dxa" w:w="397"/>
+            <w:vAlign w:val="center"/>
+          </w:tcPr>
+          <w:p>
+            <w:pPr>
+              <w:spacing w:after="0" w:before="0"/>
+              <w:jc w:val="center"/>
+            </w:pPr>
+            <w:r>
+              <w:rPr>
+                <w:b w:val="0"/>
+                <w:sz w:val="18"/>
+              </w:rPr>
+              <w:t>30</w:t>
+            </w:r>
+          </w:p>
+        </w:tc>
+        <w:tc>
+          <w:tcPr>
+            <w:tcW w:type="dxa" w:w="2778"/>
+          </w:tcPr>
+          <w:p/>
+        </w:tc>
+        <w:tc>
+          <w:tcPr>
+            <w:tcW w:type="dxa" w:w="635"/>
+            <w:shd w:val="clear" w:color="auto" w:fill="FDE2E2"/>
+          </w:tcPr>
+          <w:p/>
+        </w:tc>
+        <w:tc>
+          <w:tcPr>
+            <w:tcW w:type="dxa" w:w="635"/>
+            <w:shd w:val="clear" w:color="auto" w:fill="FDE2E2"/>
+          </w:tcPr>
+          <w:p/>
+        </w:tc>
+        <w:tc>
+          <w:tcPr>
+            <w:tcW w:type="dxa" w:w="635"/>
+            <w:shd w:val="clear" w:color="auto" w:fill="FDE2E2"/>
+          </w:tcPr>
+          <w:p/>
+        </w:tc>
+        <w:tc>
+          <w:tcPr>
+            <w:tcW w:type="dxa" w:w="635"/>
+            <w:shd w:val="clear" w:color="auto" w:fill="FEF6D0"/>
+          </w:tcPr>
+          <w:p/>
+        </w:tc>
+        <w:tc>
+          <w:tcPr>
+            <w:tcW w:type="dxa" w:w="635"/>
+            <w:shd w:val="clear" w:color="auto" w:fill="FEF6D0"/>
+          </w:tcPr>
+          <w:p/>
+        </w:tc>
+        <w:tc>
+          <w:tcPr>
+            <w:tcW w:type="dxa" w:w="635"/>
+            <w:shd w:val="clear" w:color="auto" w:fill="FEF6D0"/>
+          </w:tcPr>
+          <w:p/>
+        </w:tc>
+        <w:tc>
+          <w:tcPr>
+            <w:tcW w:type="dxa" w:w="635"/>
+            <w:shd w:val="clear" w:color="auto" w:fill="DCE7FD"/>
+          </w:tcPr>
+          <w:p/>
+        </w:tc>
+        <w:tc>
+          <w:tcPr>
+            <w:tcW w:type="dxa" w:w="635"/>
+            <w:shd w:val="clear" w:color="auto" w:fill="DCE7FD"/>
+          </w:tcPr>
+          <w:p/>
+        </w:tc>
+        <w:tc>
+          <w:tcPr>
+            <w:tcW w:type="dxa" w:w="635"/>
+            <w:shd w:val="clear" w:color="auto" w:fill="DCE7FD"/>
+          </w:tcPr>
+          <w:p/>
+        </w:tc>
+        <w:tc>
+          <w:tcPr>
+            <w:tcW w:type="dxa" w:w="635"/>
+            <w:shd w:val="clear" w:color="auto" w:fill="DCF3E4"/>
+          </w:tcPr>
+          <w:p/>
+        </w:tc>
+        <w:tc>
+          <w:tcPr>
+            <w:tcW w:type="dxa" w:w="635"/>
+            <w:shd w:val="clear" w:color="auto" w:fill="DCF3E4"/>
+          </w:tcPr>
+          <w:p/>
+        </w:tc>
+        <w:tc>
+          <w:tcPr>
+            <w:tcW w:type="dxa" w:w="635"/>
+            <w:shd w:val="clear" w:color="auto" w:fill="DCF3E4"/>
           </w:tcPr>
           <w:p/>
         </w:tc>
@@ -3708,7 +4254,7 @@
       </w:tr>
       <w:tr>
         <w:trPr>
-          <w:trHeight w:val="482" w:hRule="atLeast"/>
+          <w:trHeight w:val="408" w:hRule="atLeast"/>
         </w:trPr>
         <w:tc>
           <w:tcPr>
@@ -3725,7 +4271,7 @@
             <w:r>
               <w:drawing>
                 <wp:inline xmlns:a="http://schemas.openxmlformats.org/drawingml/2006/main" xmlns:pic="http://schemas.openxmlformats.org/drawingml/2006/picture">
-                  <wp:extent cx="270000" cy="270000"/>
+                  <wp:extent cx="223200" cy="223200"/>
                   <wp:docPr id="5" name="Picture 5"/>
                   <wp:cNvGraphicFramePr>
                     <a:graphicFrameLocks noChangeAspect="1"/>
@@ -3746,7 +4292,7 @@
                         <pic:spPr>
                           <a:xfrm>
                             <a:off x="0" y="0"/>
-                            <a:ext cx="270000" cy="270000"/>
+                            <a:ext cx="223200" cy="223200"/>
                           </a:xfrm>
                           <a:prstGeom prst="rect"/>
                         </pic:spPr>
@@ -3818,7 +4364,7 @@
       </w:tr>
       <w:tr>
         <w:trPr>
-          <w:trHeight w:val="482" w:hRule="atLeast"/>
+          <w:trHeight w:val="408" w:hRule="atLeast"/>
         </w:trPr>
         <w:tc>
           <w:tcPr>
@@ -3835,7 +4381,7 @@
             <w:r>
               <w:drawing>
                 <wp:inline xmlns:a="http://schemas.openxmlformats.org/drawingml/2006/main" xmlns:pic="http://schemas.openxmlformats.org/drawingml/2006/picture">
-                  <wp:extent cx="270000" cy="270000"/>
+                  <wp:extent cx="223200" cy="223200"/>
                   <wp:docPr id="6" name="Picture 6"/>
                   <wp:cNvGraphicFramePr>
                     <a:graphicFrameLocks noChangeAspect="1"/>
@@ -3856,7 +4402,7 @@
                         <pic:spPr>
                           <a:xfrm>
                             <a:off x="0" y="0"/>
-                            <a:ext cx="270000" cy="270000"/>
+                            <a:ext cx="223200" cy="223200"/>
                           </a:xfrm>
                           <a:prstGeom prst="rect"/>
                         </pic:spPr>
@@ -3928,7 +4474,7 @@
       </w:tr>
       <w:tr>
         <w:trPr>
-          <w:trHeight w:val="482" w:hRule="atLeast"/>
+          <w:trHeight w:val="408" w:hRule="atLeast"/>
         </w:trPr>
         <w:tc>
           <w:tcPr>
@@ -3945,7 +4491,7 @@
             <w:r>
               <w:drawing>
                 <wp:inline xmlns:a="http://schemas.openxmlformats.org/drawingml/2006/main" xmlns:pic="http://schemas.openxmlformats.org/drawingml/2006/picture">
-                  <wp:extent cx="270000" cy="270000"/>
+                  <wp:extent cx="223200" cy="223200"/>
                   <wp:docPr id="7" name="Picture 7"/>
                   <wp:cNvGraphicFramePr>
                     <a:graphicFrameLocks noChangeAspect="1"/>
@@ -3966,7 +4512,7 @@
                         <pic:spPr>
                           <a:xfrm>
                             <a:off x="0" y="0"/>
-                            <a:ext cx="270000" cy="270000"/>
+                            <a:ext cx="223200" cy="223200"/>
                           </a:xfrm>
                           <a:prstGeom prst="rect"/>
                         </pic:spPr>
@@ -4038,7 +4584,7 @@
       </w:tr>
       <w:tr>
         <w:trPr>
-          <w:trHeight w:val="482" w:hRule="atLeast"/>
+          <w:trHeight w:val="408" w:hRule="atLeast"/>
         </w:trPr>
         <w:tc>
           <w:tcPr>
@@ -4055,7 +4601,7 @@
             <w:r>
               <w:drawing>
                 <wp:inline xmlns:a="http://schemas.openxmlformats.org/drawingml/2006/main" xmlns:pic="http://schemas.openxmlformats.org/drawingml/2006/picture">
-                  <wp:extent cx="270000" cy="270000"/>
+                  <wp:extent cx="223200" cy="223200"/>
                   <wp:docPr id="8" name="Picture 8"/>
                   <wp:cNvGraphicFramePr>
                     <a:graphicFrameLocks noChangeAspect="1"/>
@@ -4076,7 +4622,7 @@
                         <pic:spPr>
                           <a:xfrm>
                             <a:off x="0" y="0"/>
-                            <a:ext cx="270000" cy="270000"/>
+                            <a:ext cx="223200" cy="223200"/>
                           </a:xfrm>
                           <a:prstGeom prst="rect"/>
                         </pic:spPr>
@@ -4148,7 +4694,7 @@
       </w:tr>
       <w:tr>
         <w:trPr>
-          <w:trHeight w:val="454" w:hRule="atLeast"/>
+          <w:trHeight w:val="369" w:hRule="atLeast"/>
         </w:trPr>
         <w:tc>
           <w:tcPr>
@@ -4202,7 +4748,7 @@
       </w:tr>
       <w:tr>
         <w:trPr>
-          <w:trHeight w:val="454" w:hRule="atLeast"/>
+          <w:trHeight w:val="369" w:hRule="atLeast"/>
         </w:trPr>
         <w:tc>
           <w:tcPr>

</xml_diff>